<commit_message>
feat: add week 6-7 materials, update week 4
- week_6: Agent Fundamentals lab (ADK + LangChain agents, activities, completed docx/pdf)
- week_7: Google ADK lab, reset_session_log tool on both agents, completed docx/pdf
- week_4: RAG notebook and docx exercise updates
- ignore local .adk/ runtime session dbs
</commit_message>
<xml_diff>
--- a/week_4/week-04-José-Martínez.docx
+++ b/week_4/week-04-José-Martínez.docx
@@ -328,6 +328,9 @@
     <w:p/>
     <w:p>
       <w:r>
+        <w:rPr>
+          <w:noProof/>
+        </w:rPr>
         <w:drawing>
           <wp:inline distT="0" distB="0" distL="0" distR="0" wp14:anchorId="6E593470" wp14:editId="698FC3C1">
             <wp:extent cx="5486400" cy="2086610"/>
@@ -397,6 +400,9 @@
     </w:p>
     <w:p>
       <w:r>
+        <w:rPr>
+          <w:noProof/>
+        </w:rPr>
         <w:drawing>
           <wp:inline distT="0" distB="0" distL="0" distR="0" wp14:anchorId="1A56BD8E" wp14:editId="531DBC78">
             <wp:extent cx="5486400" cy="3112135"/>
@@ -452,6 +458,9 @@
     <w:p/>
     <w:p>
       <w:r>
+        <w:rPr>
+          <w:noProof/>
+        </w:rPr>
         <w:drawing>
           <wp:inline distT="0" distB="0" distL="0" distR="0" wp14:anchorId="7F902475" wp14:editId="6359D532">
             <wp:extent cx="5486400" cy="3029585"/>
@@ -494,13 +503,7 @@
         <w:t>The in-scope question gets a grounded, detailed answer built only from the retrieved chunks. The out-of-scope question ("What programming language does the course use?", never stated anywhere in COURSE_DOCS) gets a clean decline instead of a guess -- exactly the behavior quiz question 3 is about: this only works because the prompt explicitly says "if the answer isn't in the context, say you don't have that information", not because the model is naturally cautious.</w:t>
       </w:r>
     </w:p>
-    <w:p>
-      <w:pPr>
-        <w:rPr>
-          <w:lang w:val="es-CO"/>
-        </w:rPr>
-      </w:pPr>
-    </w:p>
+    <w:p/>
     <w:p>
       <w:r>
         <w:rPr>
@@ -542,6 +545,9 @@
     </w:p>
     <w:p>
       <w:r>
+        <w:rPr>
+          <w:noProof/>
+        </w:rPr>
         <w:lastRenderedPageBreak/>
         <w:drawing>
           <wp:inline distT="0" distB="0" distL="0" distR="0" wp14:anchorId="5422064F" wp14:editId="3E18D160">
@@ -612,6 +618,9 @@
     </w:p>
     <w:p>
       <w:r>
+        <w:rPr>
+          <w:noProof/>
+        </w:rPr>
         <w:lastRenderedPageBreak/>
         <w:drawing>
           <wp:inline distT="0" distB="0" distL="0" distR="0" wp14:anchorId="15EC8B61" wp14:editId="09AB82D9">
@@ -652,6 +661,9 @@
     </w:p>
     <w:p>
       <w:r>
+        <w:rPr>
+          <w:noProof/>
+        </w:rPr>
         <w:drawing>
           <wp:inline distT="0" distB="0" distL="0" distR="0" wp14:anchorId="3F3AE1B0" wp14:editId="42A029EB">
             <wp:extent cx="5486400" cy="3172460"/>
@@ -800,6 +812,9 @@
     </w:p>
     <w:p>
       <w:r>
+        <w:rPr>
+          <w:noProof/>
+        </w:rPr>
         <w:lastRenderedPageBreak/>
         <w:drawing>
           <wp:inline distT="0" distB="0" distL="0" distR="0" wp14:anchorId="6968F6D1" wp14:editId="7ADC2BFE">
@@ -857,15 +872,6 @@
       <w:proofErr w:type="gramEnd"/>
       <w:r>
         <w:t>.</w:t>
-      </w:r>
-    </w:p>
-    <w:p>
-      <w:r>
-        <w:rPr>
-          <w:b/>
-          <w:sz w:val="28"/>
-        </w:rPr>
-        <w:t>Activity 6 · Corte 1 Project: Delivery Checklist &amp; Rubric</w:t>
       </w:r>
     </w:p>
     <w:p>

</xml_diff>